<commit_message>
feat(core): improve v2 Word fidelity
Add semantic support for the first document slices and harden normalized save/reopen so the canonical fixture renders and opens consistently in Word.

Co-authored-by: Cursor <cursoragent@cursor.com>
</commit_message>
<xml_diff>
--- a/e2e/fixtures/comprehensive-word-element-test.docx
+++ b/e2e/fixtures/comprehensive-word-element-test.docx
@@ -655,9 +655,13 @@
         <w:t xml:space="preserve">Smart quotes: “Double quoted” and ‘Single quoted’ with an apostrophe it’s.</w:t>
       </w:r>
     </w:p>
-    <w:pBdr>
-      <w:bottom w:val="single" w:color="auto" w:sz="6" w:space="1"/>
-    </w:pBdr>
+    <w:p>
+      <w:pPr>
+        <w:pBdr>
+          <w:bottom w:val="single" w:color="auto" w:sz="6" w:space="1"/>
+        </w:pBdr>
+      </w:pPr>
+    </w:p>
     <w:p>
       <w:r>
         <w:br w:type="page"/>
@@ -3251,7 +3255,9 @@
         <w:t xml:space="preserve">text with a QA review comment</w:t>
       </w:r>
       <w:commentRangeEnd w:id="0"/>
-      <w:commentReference w:id="0"/>
+      <w:r>
+        <w:commentReference w:id="0"/>
+      </w:r>
       <w:r>
         <w:t xml:space="preserve"> attached to it. And here is </w:t>
       </w:r>
@@ -3263,7 +3269,9 @@
         <w:t xml:space="preserve">legal-approved text</w:t>
       </w:r>
       <w:commentRangeEnd w:id="1"/>
-      <w:commentReference w:id="1"/>
+      <w:r>
+        <w:commentReference w:id="1"/>
+      </w:r>
       <w:r>
         <w:t xml:space="preserve"> with another comment.</w:t>
       </w:r>
@@ -3286,8 +3294,12 @@
       </w:r>
       <w:commentRangeEnd w:id="3"/>
       <w:commentRangeEnd w:id="2"/>
-      <w:commentReference w:id="2"/>
-      <w:commentReference w:id="3"/>
+      <w:r>
+        <w:commentReference w:id="2"/>
+      </w:r>
+      <w:r>
+        <w:commentReference w:id="3"/>
+      </w:r>
       <w:r>
         <w:t xml:space="preserve"> demonstrating threaded comments.</w:t>
       </w:r>
@@ -3529,7 +3541,7 @@
           <wp:inline distT="0" distB="0" distL="0" distR="0">
             <wp:extent cx="190500" cy="190500"/>
             <wp:effectExtent t="0" r="0" b="0" l="0"/>
-            <wp:docPr id="1" name="red" descr="Red square" title="Red"/>
+            <wp:docPr id="2" name="red" descr="Red square" title="Red"/>
             <wp:cNvGraphicFramePr>
               <a:graphicFrameLocks xmlns:a="http://schemas.openxmlformats.org/drawingml/2006/main" noChangeAspect="1"/>
             </wp:cNvGraphicFramePr>
@@ -3568,7 +3580,7 @@
           <wp:inline distT="0" distB="0" distL="0" distR="0">
             <wp:extent cx="190500" cy="190500"/>
             <wp:effectExtent t="0" r="0" b="0" l="0"/>
-            <wp:docPr id="1" name="blue" descr="Blue square" title="Blue"/>
+            <wp:docPr id="3" name="blue" descr="Blue square" title="Blue"/>
             <wp:cNvGraphicFramePr>
               <a:graphicFrameLocks xmlns:a="http://schemas.openxmlformats.org/drawingml/2006/main" noChangeAspect="1"/>
             </wp:cNvGraphicFramePr>
@@ -3607,7 +3619,7 @@
           <wp:inline distT="0" distB="0" distL="0" distR="0">
             <wp:extent cx="190500" cy="190500"/>
             <wp:effectExtent t="0" r="0" b="0" l="0"/>
-            <wp:docPr id="1" name="green" descr="Green square" title="Green"/>
+            <wp:docPr id="4" name="green" descr="Green square" title="Green"/>
             <wp:cNvGraphicFramePr>
               <a:graphicFrameLocks xmlns:a="http://schemas.openxmlformats.org/drawingml/2006/main" noChangeAspect="1"/>
             </wp:cNvGraphicFramePr>
@@ -3646,7 +3658,7 @@
           <wp:inline distT="0" distB="0" distL="0" distR="0">
             <wp:extent cx="190500" cy="190500"/>
             <wp:effectExtent t="0" r="0" b="0" l="0"/>
-            <wp:docPr id="1" name="orange" descr="Orange square" title="Orange"/>
+            <wp:docPr id="5" name="orange" descr="Orange square" title="Orange"/>
             <wp:cNvGraphicFramePr>
               <a:graphicFrameLocks xmlns:a="http://schemas.openxmlformats.org/drawingml/2006/main" noChangeAspect="1"/>
             </wp:cNvGraphicFramePr>
@@ -3701,7 +3713,7 @@
           <wp:inline distT="0" distB="0" distL="0" distR="0">
             <wp:extent cx="2857500" cy="762000"/>
             <wp:effectExtent t="0" r="0" b="0" l="0"/>
-            <wp:docPr id="1" name="banner" descr="Test banner" title="Banner"/>
+            <wp:docPr id="6" name="banner" descr="Test banner" title="Banner"/>
             <wp:cNvGraphicFramePr>
               <a:graphicFrameLocks xmlns:a="http://schemas.openxmlformats.org/drawingml/2006/main" noChangeAspect="1"/>
             </wp:cNvGraphicFramePr>
@@ -3778,7 +3790,7 @@
             <wp:extent cx="952500" cy="952500"/>
             <wp:effectExtent t="0" r="0" b="0" l="0"/>
             <wp:wrapSquare wrapText="bothSides" distT="0" distB="0" distL="114300" distR="0"/>
-            <wp:docPr id="1" name="float" descr="Floating image" title="Float"/>
+            <wp:docPr id="7" name="float" descr="Floating image" title="Float"/>
             <wp:cNvGraphicFramePr>
               <a:graphicFrameLocks xmlns:a="http://schemas.openxmlformats.org/drawingml/2006/main" noChangeAspect="1"/>
             </wp:cNvGraphicFramePr>
@@ -3923,9 +3935,13 @@
         <w:t xml:space="preserve">11.3 Thematic Break (Horizontal Rule)</w:t>
       </w:r>
     </w:p>
-    <w:pBdr>
-      <w:bottom w:val="single" w:color="auto" w:sz="6" w:space="1"/>
-    </w:pBdr>
+    <w:p>
+      <w:pPr>
+        <w:pBdr>
+          <w:bottom w:val="single" w:color="auto" w:sz="6" w:space="1"/>
+        </w:pBdr>
+      </w:pPr>
+    </w:p>
     <w:p>
       <w:pPr>
         <w:spacing w:after="120"/>
@@ -4511,8 +4527,8 @@
       <w:pPr>
         <w:pBdr>
           <w:top w:val="single" w:color="000000" w:sz="1" w:space="4"/>
+          <w:left w:val="single" w:color="000000" w:sz="1" w:space="8"/>
           <w:bottom w:val="single" w:color="000000" w:sz="1" w:space="4"/>
-          <w:left w:val="single" w:color="000000" w:sz="1" w:space="8"/>
           <w:right w:val="single" w:color="000000" w:sz="1" w:space="8"/>
         </w:pBdr>
         <w:shd w:fill="FAFAFA" w:val="clear"/>
@@ -4548,8 +4564,8 @@
       <w:pPr>
         <w:pBdr>
           <w:top w:val="single" w:color="2E75B6" w:sz="3" w:space="4"/>
+          <w:left w:val="single" w:color="2E75B6" w:sz="3" w:space="8"/>
           <w:bottom w:val="single" w:color="2E75B6" w:sz="3" w:space="4"/>
-          <w:left w:val="single" w:color="2E75B6" w:sz="3" w:space="8"/>
           <w:right w:val="single" w:color="2E75B6" w:sz="3" w:space="8"/>
         </w:pBdr>
         <w:shd w:fill="E8F0FE" w:val="clear"/>
@@ -4571,8 +4587,8 @@
       <w:pPr>
         <w:pBdr>
           <w:top w:val="single" w:color="CC6600" w:sz="6" w:space="4"/>
+          <w:left w:val="thick" w:color="CC6600" w:sz="12" w:space="8"/>
           <w:bottom w:val="single" w:color="CC6600" w:sz="6" w:space="4"/>
-          <w:left w:val="thick" w:color="CC6600" w:sz="12" w:space="8"/>
           <w:right w:val="single" w:color="CC6600" w:sz="1" w:space="8"/>
         </w:pBdr>
         <w:shd w:fill="FFF8E1" w:val="clear"/>
@@ -4594,8 +4610,8 @@
       <w:pPr>
         <w:pBdr>
           <w:top w:val="single" w:color="28A745" w:sz="1" w:space="4"/>
+          <w:left w:val="thick" w:color="28A745" w:sz="12" w:space="8"/>
           <w:bottom w:val="single" w:color="28A745" w:sz="1" w:space="4"/>
-          <w:left w:val="thick" w:color="28A745" w:sz="12" w:space="8"/>
           <w:right w:val="single" w:color="28A745" w:sz="1" w:space="8"/>
         </w:pBdr>
         <w:shd w:fill="D4EDDA" w:val="clear"/>
@@ -4620,8 +4636,8 @@
       <w:pPr>
         <w:pBdr>
           <w:top w:val="single" w:color="DC3545" w:sz="1" w:space="4"/>
+          <w:left w:val="thick" w:color="DC3545" w:sz="12" w:space="8"/>
           <w:bottom w:val="single" w:color="DC3545" w:sz="1" w:space="4"/>
-          <w:left w:val="thick" w:color="DC3545" w:sz="12" w:space="8"/>
           <w:right w:val="single" w:color="DC3545" w:sz="1" w:space="8"/>
         </w:pBdr>
         <w:shd w:fill="F8D7DA" w:val="clear"/>
@@ -4814,7 +4830,7 @@
         </w:rPr>
         <w:t xml:space="preserve">PAGE: </w:t>
       </w:r>
-      <w:fldSimple w:instr="[object Object]"/>
+      <w:fldSimple w:instr="PAGE"/>
     </w:p>
     <w:p>
       <w:pPr>
@@ -4827,7 +4843,7 @@
         </w:rPr>
         <w:t xml:space="preserve">NUMPAGES: </w:t>
       </w:r>
-      <w:fldSimple w:instr="[object Object]"/>
+      <w:fldSimple w:instr="NUMPAGES"/>
     </w:p>
     <w:p>
       <w:pPr>
@@ -4840,7 +4856,7 @@
         </w:rPr>
         <w:t xml:space="preserve">TITLE: </w:t>
       </w:r>
-      <w:fldSimple w:instr="[object Object]"/>
+      <w:fldSimple w:instr="TITLE"/>
     </w:p>
     <w:p>
       <w:pPr>
@@ -4853,7 +4869,7 @@
         </w:rPr>
         <w:t xml:space="preserve">AUTHOR: </w:t>
       </w:r>
-      <w:fldSimple w:instr="[object Object]"/>
+      <w:fldSimple w:instr="AUTHOR"/>
     </w:p>
     <w:p>
       <w:pPr>
@@ -4866,7 +4882,7 @@
         </w:rPr>
         <w:t xml:space="preserve">DATE: </w:t>
       </w:r>
-      <w:fldSimple w:instr="[object Object]"/>
+      <w:fldSimple w:instr="DATE"/>
     </w:p>
     <w:p>
       <w:pPr>
@@ -4879,7 +4895,7 @@
         </w:rPr>
         <w:t xml:space="preserve">TIME: </w:t>
       </w:r>
-      <w:fldSimple w:instr="[object Object]"/>
+      <w:fldSimple w:instr="TIME"/>
     </w:p>
     <w:p>
       <w:pPr>
@@ -4892,7 +4908,7 @@
         </w:rPr>
         <w:t xml:space="preserve">FILENAME: </w:t>
       </w:r>
-      <w:fldSimple w:instr="[object Object]"/>
+      <w:fldSimple w:instr="FILENAME"/>
     </w:p>
     <w:p>
       <w:r>
@@ -4919,9 +4935,8 @@
     </w:p>
     <w:tbl>
       <w:tblPr>
-        <w:tblpPr w:tblpY="200" w:horzAnchor="margin" w:tblpXSpec="center" w:vertAnchor="text">
-          <w:tblOverlap w:val="never"/>
-        </w:tblpPr>
+        <w:tblpPr w:tblpY="200" w:horzAnchor="margin" w:tblpXSpec="center" w:vertAnchor="text"/>
+        <w:tblOverlap w:val="never"/>
         <w:tblW w:type="dxa" w:w="5000"/>
         <w:tblBorders>
           <w:top w:val="single" w:color="auto" w:sz="4"/>
@@ -5566,7 +5581,7 @@
                 <wp:inline distT="0" distB="0" distL="0" distR="0">
                   <wp:extent cx="381000" cy="381000"/>
                   <wp:effectExtent t="0" r="0" b="0" l="0"/>
-                  <wp:docPr id="1" name="red" descr="Red square" title="Red"/>
+                  <wp:docPr id="8" name="red" descr="Red square" title="Red"/>
                   <wp:cNvGraphicFramePr>
                     <a:graphicFrameLocks xmlns:a="http://schemas.openxmlformats.org/drawingml/2006/main" noChangeAspect="1"/>
                   </wp:cNvGraphicFramePr>
@@ -5642,7 +5657,7 @@
                 <wp:inline distT="0" distB="0" distL="0" distR="0">
                   <wp:extent cx="381000" cy="381000"/>
                   <wp:effectExtent t="0" r="0" b="0" l="0"/>
-                  <wp:docPr id="1" name="blue" descr="Blue square" title="Blue"/>
+                  <wp:docPr id="9" name="blue" descr="Blue square" title="Blue"/>
                   <wp:cNvGraphicFramePr>
                     <a:graphicFrameLocks xmlns:a="http://schemas.openxmlformats.org/drawingml/2006/main" noChangeAspect="1"/>
                   </wp:cNvGraphicFramePr>
@@ -5718,7 +5733,7 @@
                 <wp:inline distT="0" distB="0" distL="0" distR="0">
                   <wp:extent cx="381000" cy="381000"/>
                   <wp:effectExtent t="0" r="0" b="0" l="0"/>
-                  <wp:docPr id="1" name="green" descr="Green square" title="Green"/>
+                  <wp:docPr id="10" name="green" descr="Green square" title="Green"/>
                   <wp:cNvGraphicFramePr>
                     <a:graphicFrameLocks xmlns:a="http://schemas.openxmlformats.org/drawingml/2006/main" noChangeAspect="1"/>
                   </wp:cNvGraphicFramePr>
@@ -5794,7 +5809,7 @@
                 <wp:inline distT="0" distB="0" distL="0" distR="0">
                   <wp:extent cx="381000" cy="381000"/>
                   <wp:effectExtent t="0" r="0" b="0" l="0"/>
-                  <wp:docPr id="1" name="orange" descr="Orange square" title="Orange"/>
+                  <wp:docPr id="11" name="orange" descr="Orange square" title="Orange"/>
                   <wp:cNvGraphicFramePr>
                     <a:graphicFrameLocks xmlns:a="http://schemas.openxmlformats.org/drawingml/2006/main" noChangeAspect="1"/>
                   </wp:cNvGraphicFramePr>
@@ -8016,8 +8031,8 @@
           </w:pPr>
           <w:r>
             <w:rPr>
+              <w:i/>
               <w:color w:val="808080"/>
-              <w:i/>
             </w:rPr>
             <w:t>Click here to enter your full name</w:t>
           </w:r>
@@ -8049,8 +8064,8 @@
           </w:pPr>
           <w:r>
             <w:rPr>
+              <w:i/>
               <w:color w:val="808080"/>
-              <w:i/>
             </w:rPr>
             <w:t>Click here to enter rich text (supports bold, italic, etc.)</w:t>
           </w:r>
@@ -8092,8 +8107,8 @@
           </w:pPr>
           <w:r>
             <w:rPr>
+              <w:i/>
               <w:color w:val="808080"/>
-              <w:i/>
             </w:rPr>
             <w:t>Choose a department...</w:t>
           </w:r>
@@ -8133,8 +8148,8 @@
           </w:pPr>
           <w:r>
             <w:rPr>
+              <w:i/>
               <w:color w:val="808080"/>
-              <w:i/>
             </w:rPr>
             <w:t>Select or type priority...</w:t>
           </w:r>
@@ -8172,8 +8187,8 @@
           </w:pPr>
           <w:r>
             <w:rPr>
+              <w:i/>
               <w:color w:val="808080"/>
-              <w:i/>
             </w:rPr>
             <w:t>Click to select a date...</w:t>
           </w:r>
@@ -8211,8 +8226,8 @@
           </w:pPr>
           <w:r>
             <w:rPr>
+              <w:i/>
               <w:color w:val="808080"/>
-              <w:i/>
             </w:rPr>
             <w:t>Click to select a date...</w:t>
           </w:r>
@@ -8253,8 +8268,8 @@
           </w:pPr>
           <w:r>
             <w:rPr>
+              <w:i/>
               <w:color w:val="808080"/>
-              <w:i/>
             </w:rPr>
             <w:t>Select status...</w:t>
           </w:r>
@@ -8319,8 +8334,8 @@
               <w:p>
                 <w:r>
                   <w:rPr>
+                    <w:i/>
                     <w:color w:val="808080"/>
-                    <w:i/>
                   </w:rPr>
                   <w:t>Enter project name</w:t>
                 </w:r>
@@ -8366,8 +8381,8 @@
               <w:p>
                 <w:r>
                   <w:rPr>
+                    <w:i/>
                     <w:color w:val="808080"/>
-                    <w:i/>
                   </w:rPr>
                   <w:t>Select team lead...</w:t>
                 </w:r>
@@ -8412,8 +8427,8 @@
               <w:p>
                 <w:r>
                   <w:rPr>
+                    <w:i/>
                     <w:color w:val="808080"/>
-                    <w:i/>
                   </w:rPr>
                   <w:t>Select target date</w:t>
                 </w:r>
@@ -8460,8 +8475,8 @@
               <w:p>
                 <w:r>
                   <w:rPr>
+                    <w:i/>
                     <w:color w:val="808080"/>
-                    <w:i/>
                   </w:rPr>
                   <w:t>Select risk level...</w:t>
                 </w:r>
@@ -8500,8 +8515,8 @@
               <w:p>
                 <w:r>
                   <w:rPr>
+                    <w:i/>
                     <w:color w:val="808080"/>
-                    <w:i/>
                   </w:rPr>
                   <w:t>Enter rich text description</w:t>
                 </w:r>
@@ -14078,6 +14093,16 @@
     </w:rPrDefault>
     <w:pPrDefault/>
   </w:docDefaults>
+  <w:style w:type="paragraph" w:default="1" w:styleId="Normal">
+    <w:name w:val="Normal"/>
+    <w:qFormat/>
+  </w:style>
+  <w:style w:type="character" w:default="1" w:styleId="DefaultParagraphFont">
+    <w:name w:val="Default Paragraph Font"/>
+    <w:uiPriority w:val="1"/>
+    <w:semiHidden/>
+    <w:unhideWhenUsed/>
+  </w:style>
   <w:style w:type="paragraph" w:styleId="Title">
     <w:name w:val="Title"/>
     <w:basedOn w:val="Normal"/>
@@ -14086,59 +14111,6 @@
     <w:rPr>
       <w:sz w:val="56"/>
       <w:szCs w:val="56"/>
-    </w:rPr>
-  </w:style>
-  <w:style w:type="paragraph" w:styleId="Heading1">
-    <w:name w:val="Heading 1"/>
-    <w:basedOn w:val="Normal"/>
-    <w:next w:val="Normal"/>
-    <w:qFormat/>
-    <w:rPr>
-      <w:color w:val="2E74B5"/>
-      <w:sz w:val="32"/>
-      <w:szCs w:val="32"/>
-    </w:rPr>
-  </w:style>
-  <w:style w:type="paragraph" w:styleId="Heading2">
-    <w:name w:val="Heading 2"/>
-    <w:basedOn w:val="Normal"/>
-    <w:next w:val="Normal"/>
-    <w:qFormat/>
-    <w:rPr>
-      <w:color w:val="2E74B5"/>
-      <w:sz w:val="26"/>
-      <w:szCs w:val="26"/>
-    </w:rPr>
-  </w:style>
-  <w:style w:type="paragraph" w:styleId="Heading3">
-    <w:name w:val="Heading 3"/>
-    <w:basedOn w:val="Normal"/>
-    <w:next w:val="Normal"/>
-    <w:qFormat/>
-    <w:rPr>
-      <w:color w:val="1F4D78"/>
-      <w:sz w:val="24"/>
-      <w:szCs w:val="24"/>
-    </w:rPr>
-  </w:style>
-  <w:style w:type="paragraph" w:styleId="Heading4">
-    <w:name w:val="Heading 4"/>
-    <w:basedOn w:val="Normal"/>
-    <w:next w:val="Normal"/>
-    <w:qFormat/>
-    <w:rPr>
-      <w:i/>
-      <w:iCs/>
-      <w:color w:val="2E74B5"/>
-    </w:rPr>
-  </w:style>
-  <w:style w:type="paragraph" w:styleId="Heading5">
-    <w:name w:val="Heading 5"/>
-    <w:basedOn w:val="Normal"/>
-    <w:next w:val="Normal"/>
-    <w:qFormat/>
-    <w:rPr>
-      <w:color w:val="2E74B5"/>
     </w:rPr>
   </w:style>
   <w:style w:type="paragraph" w:styleId="Heading6">

</xml_diff>

<commit_message>
fix: stop inventing thematic-break paragraphs from orphaned w:pBdr
The comprehensive fixture had wrapped body-level w:pBdr siblings in empty
paragraphs, which painted a horizontal rule Word never shows for the
misplaced markup. Restore the orphan encoding and lock both the suppressed
and legitimate empty-paragraph border cases in tests.

Co-authored-by: Cursor <cursoragent@cursor.com>
</commit_message>
<xml_diff>
--- a/e2e/fixtures/comprehensive-word-element-test.docx
+++ b/e2e/fixtures/comprehensive-word-element-test.docx
@@ -655,13 +655,9 @@
         <w:t xml:space="preserve">Smart quotes: “Double quoted” and ‘Single quoted’ with an apostrophe it’s.</w:t>
       </w:r>
     </w:p>
-    <w:p>
-      <w:pPr>
-        <w:pBdr>
-          <w:bottom w:val="single" w:color="auto" w:sz="6" w:space="1"/>
-        </w:pBdr>
-      </w:pPr>
-    </w:p>
+    <w:pBdr>
+      <w:bottom w:val="single" w:color="auto" w:sz="6" w:space="1"/>
+    </w:pBdr>
     <w:p>
       <w:r>
         <w:br w:type="page"/>
@@ -3935,13 +3931,9 @@
         <w:t xml:space="preserve">11.3 Thematic Break (Horizontal Rule)</w:t>
       </w:r>
     </w:p>
-    <w:p>
-      <w:pPr>
-        <w:pBdr>
-          <w:bottom w:val="single" w:color="auto" w:sz="6" w:space="1"/>
-        </w:pBdr>
-      </w:pPr>
-    </w:p>
+    <w:pBdr>
+      <w:bottom w:val="single" w:color="auto" w:sz="6" w:space="1"/>
+    </w:pBdr>
     <w:p>
       <w:pPr>
         <w:spacing w:after="120"/>

</xml_diff>

<commit_message>
fix: keep range delete working across inert body siblings (#133)
* fix: stop inventing thematic-break paragraphs from orphaned w:pBdr

The comprehensive fixture had wrapped body-level w:pBdr siblings in empty
paragraphs, which painted a horizontal rule Word never shows for the
misplaced markup. Restore the orphan encoding and lock both the suppressed
and legitimate empty-paragraph border cases in tests.

Co-authored-by: Cursor <cursoragent@cursor.com>

* fix: keep range delete working across inert body siblings

Restoring the comprehensive fixture's orphaned body-level w:pBdr exposed
that select-all delete planned joins across those generics and the store
refused them, vetoing the whole removal. Treat inert siblings as join
barriers. Also restore the fixture's authentic orphan encoding and pin
both the ignored-orphan and legitimate empty-paragraph border cases.

Co-authored-by: Cursor <cursoragent@cursor.com>

---------

Co-authored-by: Cursor <cursoragent@cursor.com>
</commit_message>
<xml_diff>
--- a/e2e/fixtures/comprehensive-word-element-test.docx
+++ b/e2e/fixtures/comprehensive-word-element-test.docx
@@ -655,13 +655,9 @@
         <w:t xml:space="preserve">Smart quotes: “Double quoted” and ‘Single quoted’ with an apostrophe it’s.</w:t>
       </w:r>
     </w:p>
-    <w:p>
-      <w:pPr>
-        <w:pBdr>
-          <w:bottom w:val="single" w:color="auto" w:sz="6" w:space="1"/>
-        </w:pBdr>
-      </w:pPr>
-    </w:p>
+    <w:pBdr>
+      <w:bottom w:val="single" w:color="auto" w:sz="6" w:space="1"/>
+    </w:pBdr>
     <w:p>
       <w:r>
         <w:br w:type="page"/>
@@ -3935,13 +3931,9 @@
         <w:t xml:space="preserve">11.3 Thematic Break (Horizontal Rule)</w:t>
       </w:r>
     </w:p>
-    <w:p>
-      <w:pPr>
-        <w:pBdr>
-          <w:bottom w:val="single" w:color="auto" w:sz="6" w:space="1"/>
-        </w:pBdr>
-      </w:pPr>
-    </w:p>
+    <w:pBdr>
+      <w:bottom w:val="single" w:color="auto" w:sz="6" w:space="1"/>
+    </w:pBdr>
     <w:p>
       <w:pPr>
         <w:spacing w:after="120"/>

</xml_diff>

<commit_message>
fix(fixtures): make the demo document valid OOXML
Two `w:pBdr` elements sat directly under `w:body` instead of inside the
`w:p`/`w:pPr` of the thematic breaks they describe. `w:body` takes block-level
content only, so Word rejected the package outright and refused to open it.

Regenerates the demo `sample.docx` copies built from this fixture.

Co-Authored-By: Claude Fable 5 <noreply@anthropic.com>
</commit_message>
<xml_diff>
--- a/e2e/fixtures/comprehensive-word-element-test.docx
+++ b/e2e/fixtures/comprehensive-word-element-test.docx
@@ -655,9 +655,13 @@
         <w:t xml:space="preserve">Smart quotes: “Double quoted” and ‘Single quoted’ with an apostrophe it’s.</w:t>
       </w:r>
     </w:p>
-    <w:pBdr>
-      <w:bottom w:val="single" w:color="auto" w:sz="6" w:space="1"/>
-    </w:pBdr>
+    <w:p>
+      <w:pPr>
+        <w:pBdr>
+          <w:bottom w:val="single" w:color="auto" w:sz="6" w:space="1"/>
+        </w:pBdr>
+      </w:pPr>
+    </w:p>
     <w:p>
       <w:r>
         <w:br w:type="page"/>
@@ -3931,9 +3935,13 @@
         <w:t xml:space="preserve">11.3 Thematic Break (Horizontal Rule)</w:t>
       </w:r>
     </w:p>
-    <w:pBdr>
-      <w:bottom w:val="single" w:color="auto" w:sz="6" w:space="1"/>
-    </w:pBdr>
+    <w:p>
+      <w:pPr>
+        <w:pBdr>
+          <w:bottom w:val="single" w:color="auto" w:sz="6" w:space="1"/>
+        </w:pBdr>
+      </w:pPr>
+    </w:p>
     <w:p>
       <w:pPr>
         <w:spacing w:after="120"/>

</xml_diff>